<commit_message>
Minor date change in Project_IO_1 document
</commit_message>
<xml_diff>
--- a/docs/Project_IO_1.docx
+++ b/docs/Project_IO_1.docx
@@ -759,7 +759,6 @@
                 <w:lang w:val="en-US"/>
               </w:rPr>
             </w:pPr>
-            <w:proofErr w:type="spellStart"/>
             <w:r>
               <w:rPr>
                 <w:rFonts w:ascii="Almendra" w:eastAsia="Arial" w:hAnsi="Almendra" w:cs="Arial"/>
@@ -769,7 +768,6 @@
               </w:rPr>
               <w:t>FullStack</w:t>
             </w:r>
-            <w:proofErr w:type="spellEnd"/>
             <w:r>
               <w:rPr>
                 <w:rFonts w:ascii="Almendra" w:eastAsia="Arial" w:hAnsi="Almendra" w:cs="Arial"/>
@@ -827,19 +825,8 @@
                 <w:sz w:val="24"/>
                 <w:szCs w:val="24"/>
               </w:rPr>
-              <w:t xml:space="preserve">Roman </w:t>
-            </w:r>
-            <w:proofErr w:type="spellStart"/>
-            <w:r>
-              <w:rPr>
-                <w:rFonts w:ascii="Almendra" w:eastAsia="Arial" w:hAnsi="Almendra" w:cs="Arial"/>
-                <w:color w:val="000000"/>
-                <w:sz w:val="24"/>
-                <w:szCs w:val="24"/>
-              </w:rPr>
-              <w:t>Potapov</w:t>
-            </w:r>
-            <w:proofErr w:type="spellEnd"/>
+              <w:t>Roman Potapov</w:t>
+            </w:r>
           </w:p>
         </w:tc>
         <w:tc>
@@ -870,7 +857,6 @@
                 <w:szCs w:val="24"/>
               </w:rPr>
             </w:pPr>
-            <w:proofErr w:type="spellStart"/>
             <w:r>
               <w:rPr>
                 <w:rFonts w:ascii="Almendra" w:eastAsia="Arial" w:hAnsi="Almendra" w:cs="Arial"/>
@@ -880,7 +866,6 @@
               </w:rPr>
               <w:t>Backend</w:t>
             </w:r>
-            <w:proofErr w:type="spellEnd"/>
           </w:p>
         </w:tc>
       </w:tr>
@@ -912,37 +897,15 @@
                 <w:szCs w:val="24"/>
               </w:rPr>
             </w:pPr>
-            <w:proofErr w:type="spellStart"/>
-            <w:r>
-              <w:rPr>
-                <w:rFonts w:ascii="Almendra" w:eastAsia="Arial" w:hAnsi="Almendra" w:cs="Arial"/>
-                <w:color w:val="000000"/>
-                <w:sz w:val="24"/>
-                <w:szCs w:val="24"/>
-              </w:rPr>
-              <w:t>Yehor</w:t>
-            </w:r>
-            <w:proofErr w:type="spellEnd"/>
-            <w:r>
-              <w:rPr>
-                <w:rFonts w:ascii="Almendra" w:eastAsia="Arial" w:hAnsi="Almendra" w:cs="Arial"/>
-                <w:color w:val="000000"/>
-                <w:sz w:val="24"/>
-                <w:szCs w:val="24"/>
-              </w:rPr>
-              <w:t xml:space="preserve"> </w:t>
-            </w:r>
-            <w:proofErr w:type="spellStart"/>
-            <w:r>
-              <w:rPr>
-                <w:rFonts w:ascii="Almendra" w:eastAsia="Arial" w:hAnsi="Almendra" w:cs="Arial"/>
-                <w:color w:val="000000"/>
-                <w:sz w:val="24"/>
-                <w:szCs w:val="24"/>
-              </w:rPr>
-              <w:t>Zaivenko</w:t>
-            </w:r>
-            <w:proofErr w:type="spellEnd"/>
+            <w:r>
+              <w:rPr>
+                <w:rFonts w:ascii="Almendra" w:eastAsia="Arial" w:hAnsi="Almendra" w:cs="Arial"/>
+                <w:color w:val="000000"/>
+                <w:sz w:val="24"/>
+                <w:szCs w:val="24"/>
+              </w:rPr>
+              <w:t>Yehor Zaivenko</w:t>
+            </w:r>
           </w:p>
         </w:tc>
         <w:tc>
@@ -973,7 +936,6 @@
                 <w:szCs w:val="24"/>
               </w:rPr>
             </w:pPr>
-            <w:proofErr w:type="spellStart"/>
             <w:r>
               <w:rPr>
                 <w:rFonts w:ascii="Almendra" w:eastAsia="Arial" w:hAnsi="Almendra" w:cs="Arial"/>
@@ -983,7 +945,6 @@
               </w:rPr>
               <w:t>Frontend</w:t>
             </w:r>
-            <w:proofErr w:type="spellEnd"/>
           </w:p>
         </w:tc>
       </w:tr>
@@ -1066,9 +1027,8 @@
           <w:sz w:val="24"/>
           <w:szCs w:val="24"/>
         </w:rPr>
-        <w:t xml:space="preserve">Projekt zakłada stworzenie rozproszonego systemu informatycznego w architekturze klient-serwer, służącego do ewidencjonowania tajnych akt sądowymi. Ponieważ nikt nie spodziewa się Hiszpańskiej Inkwizycji, system musi działać szybko i bezwzględnie. Aplikacja kliencka zostanie napisana w boskim języku Holy C, natomiast </w:t>
+        <w:t xml:space="preserve">Projekt zakłada stworzenie rozproszonego systemu informatycznego w architekturze klient-serwer, służącego do ewidencjonowania tajnych akt sądowymi. Ponieważ nikt nie spodziewa się Hiszpańskiej Inkwizycji, system musi działać szybko i bezwzględnie. Aplikacja kliencka zostanie napisana w boskim języku Holy C, natomiast backend - pełniący rolę Głównego Inkwizytora logiki biznesowej - w języku Java, przechowując dane o grzechach w bazie PostgreSQL. </w:t>
       </w:r>
-      <w:proofErr w:type="spellStart"/>
       <w:r>
         <w:rPr>
           <w:rFonts w:ascii="Almendra" w:eastAsia="Arial" w:hAnsi="Almendra" w:cs="Arial"/>
@@ -1076,86 +1036,7 @@
           <w:sz w:val="24"/>
           <w:szCs w:val="24"/>
         </w:rPr>
-        <w:t>backend</w:t>
-      </w:r>
-      <w:proofErr w:type="spellEnd"/>
-      <w:r>
-        <w:rPr>
-          <w:rFonts w:ascii="Almendra" w:eastAsia="Arial" w:hAnsi="Almendra" w:cs="Arial"/>
-          <w:color w:val="000000"/>
-          <w:sz w:val="24"/>
-          <w:szCs w:val="24"/>
-        </w:rPr>
-        <w:t xml:space="preserve"> - pełniący rolę Głównego Inkwizytora logiki biznesowej - w języku Java, przechowując dane o grzechach w bazie </w:t>
-      </w:r>
-      <w:proofErr w:type="spellStart"/>
-      <w:r>
-        <w:rPr>
-          <w:rFonts w:ascii="Almendra" w:eastAsia="Arial" w:hAnsi="Almendra" w:cs="Arial"/>
-          <w:color w:val="000000"/>
-          <w:sz w:val="24"/>
-          <w:szCs w:val="24"/>
-        </w:rPr>
-        <w:t>PostgreSQL</w:t>
-      </w:r>
-      <w:proofErr w:type="spellEnd"/>
-      <w:r>
-        <w:rPr>
-          <w:rFonts w:ascii="Almendra" w:eastAsia="Arial" w:hAnsi="Almendra" w:cs="Arial"/>
-          <w:color w:val="000000"/>
-          <w:sz w:val="24"/>
-          <w:szCs w:val="24"/>
-        </w:rPr>
-        <w:t xml:space="preserve">. </w:t>
-      </w:r>
-      <w:r>
-        <w:rPr>
-          <w:rFonts w:ascii="Almendra" w:eastAsia="Arial" w:hAnsi="Almendra" w:cs="Arial"/>
-          <w:color w:val="000000"/>
-          <w:sz w:val="24"/>
-          <w:szCs w:val="24"/>
-        </w:rPr>
-        <w:t xml:space="preserve">System jest rozwijany z myślą o natywnym wsparciu dla systemów Windows oraz Linux, z zachowaniem </w:t>
-      </w:r>
-      <w:proofErr w:type="spellStart"/>
-      <w:r>
-        <w:rPr>
-          <w:rFonts w:ascii="Almendra" w:eastAsia="Arial" w:hAnsi="Almendra" w:cs="Arial"/>
-          <w:color w:val="000000"/>
-          <w:sz w:val="24"/>
-          <w:szCs w:val="24"/>
-        </w:rPr>
-        <w:t>wieloplatformowości</w:t>
-      </w:r>
-      <w:proofErr w:type="spellEnd"/>
-      <w:r>
-        <w:rPr>
-          <w:rFonts w:ascii="Almendra" w:eastAsia="Arial" w:hAnsi="Almendra" w:cs="Arial"/>
-          <w:color w:val="000000"/>
-          <w:sz w:val="24"/>
-          <w:szCs w:val="24"/>
-        </w:rPr>
-        <w:t xml:space="preserve"> kodu (ewentualne wsparcie dla </w:t>
-      </w:r>
-      <w:proofErr w:type="spellStart"/>
-      <w:r>
-        <w:rPr>
-          <w:rFonts w:ascii="Almendra" w:eastAsia="Arial" w:hAnsi="Almendra" w:cs="Arial"/>
-          <w:color w:val="000000"/>
-          <w:sz w:val="24"/>
-          <w:szCs w:val="24"/>
-        </w:rPr>
-        <w:t>macOS</w:t>
-      </w:r>
-      <w:proofErr w:type="spellEnd"/>
-      <w:r>
-        <w:rPr>
-          <w:rFonts w:ascii="Almendra" w:eastAsia="Arial" w:hAnsi="Almendra" w:cs="Arial"/>
-          <w:color w:val="000000"/>
-          <w:sz w:val="24"/>
-          <w:szCs w:val="24"/>
-        </w:rPr>
-        <w:t xml:space="preserve"> planowane w późniejszym etapie).</w:t>
+        <w:t>System jest rozwijany z myślą o natywnym wsparciu dla systemów Windows oraz Linux, z zachowaniem wieloplatformowości kodu (ewentualne wsparcie dla macOS planowane w późniejszym etapie).</w:t>
       </w:r>
     </w:p>
     <w:p>
@@ -1272,55 +1153,7 @@
           <w:sz w:val="18"/>
           <w:szCs w:val="18"/>
         </w:rPr>
-        <w:t xml:space="preserve">(dla każdego założenia/zadania stworzyć </w:t>
-      </w:r>
-      <w:proofErr w:type="spellStart"/>
-      <w:r>
-        <w:rPr>
-          <w:rFonts w:ascii="Almendra" w:eastAsia="Arial" w:hAnsi="Almendra" w:cs="Arial"/>
-          <w:b/>
-          <w:bCs/>
-          <w:color w:val="000000"/>
-          <w:sz w:val="18"/>
-          <w:szCs w:val="18"/>
-        </w:rPr>
-        <w:t>DoD</w:t>
-      </w:r>
-      <w:proofErr w:type="spellEnd"/>
-      <w:r>
-        <w:rPr>
-          <w:rFonts w:ascii="Almendra" w:eastAsia="Arial" w:hAnsi="Almendra" w:cs="Arial"/>
-          <w:b/>
-          <w:bCs/>
-          <w:color w:val="000000"/>
-          <w:sz w:val="18"/>
-          <w:szCs w:val="18"/>
-        </w:rPr>
-        <w:t xml:space="preserve"> (Definition of </w:t>
-      </w:r>
-      <w:proofErr w:type="spellStart"/>
-      <w:r>
-        <w:rPr>
-          <w:rFonts w:ascii="Almendra" w:eastAsia="Arial" w:hAnsi="Almendra" w:cs="Arial"/>
-          <w:b/>
-          <w:bCs/>
-          <w:color w:val="000000"/>
-          <w:sz w:val="18"/>
-          <w:szCs w:val="18"/>
-        </w:rPr>
-        <w:t>Done</w:t>
-      </w:r>
-      <w:proofErr w:type="spellEnd"/>
-      <w:r>
-        <w:rPr>
-          <w:rFonts w:ascii="Almendra" w:eastAsia="Arial" w:hAnsi="Almendra" w:cs="Arial"/>
-          <w:b/>
-          <w:bCs/>
-          <w:color w:val="000000"/>
-          <w:sz w:val="18"/>
-          <w:szCs w:val="18"/>
-        </w:rPr>
-        <w:t>)</w:t>
+        <w:t>(dla każdego założenia/zadania stworzyć DoD (Definition of Done)</w:t>
       </w:r>
     </w:p>
     <w:p>
@@ -1347,23 +1180,7 @@
           <w:rFonts w:ascii="Almendra" w:eastAsia="Arial" w:hAnsi="Almendra" w:cs="Arial"/>
           <w:color w:val="000000"/>
         </w:rPr>
-        <w:t>Architektura klient-serwer. (</w:t>
-      </w:r>
-      <w:proofErr w:type="spellStart"/>
-      <w:r>
-        <w:rPr>
-          <w:rFonts w:ascii="Almendra" w:eastAsia="Arial" w:hAnsi="Almendra" w:cs="Arial"/>
-          <w:color w:val="000000"/>
-        </w:rPr>
-        <w:t>DoD</w:t>
-      </w:r>
-      <w:proofErr w:type="spellEnd"/>
-      <w:r>
-        <w:rPr>
-          <w:rFonts w:ascii="Almendra" w:eastAsia="Arial" w:hAnsi="Almendra" w:cs="Arial"/>
-          <w:color w:val="000000"/>
-        </w:rPr>
-        <w:t>: Serwer Java i klient w Holy C potrafią nawiązać poprawne połączenie i wymieniać dane o sprawach).</w:t>
+        <w:t>Architektura klient-serwer. (DoD: Serwer Java i klient w Holy C potrafią nawiązać poprawne połączenie i wymieniać dane o sprawach).</w:t>
       </w:r>
     </w:p>
     <w:p>
@@ -1390,55 +1207,7 @@
           <w:rFonts w:ascii="Almendra" w:eastAsia="Arial" w:hAnsi="Almendra" w:cs="Arial"/>
           <w:color w:val="000000"/>
         </w:rPr>
-        <w:t xml:space="preserve">Centralny rejestr w </w:t>
-      </w:r>
-      <w:proofErr w:type="spellStart"/>
-      <w:r>
-        <w:rPr>
-          <w:rFonts w:ascii="Almendra" w:eastAsia="Arial" w:hAnsi="Almendra" w:cs="Arial"/>
-          <w:color w:val="000000"/>
-        </w:rPr>
-        <w:t>PostgreSQL</w:t>
-      </w:r>
-      <w:proofErr w:type="spellEnd"/>
-      <w:r>
-        <w:rPr>
-          <w:rFonts w:ascii="Almendra" w:eastAsia="Arial" w:hAnsi="Almendra" w:cs="Arial"/>
-          <w:color w:val="000000"/>
-        </w:rPr>
-        <w:t>. (</w:t>
-      </w:r>
-      <w:proofErr w:type="spellStart"/>
-      <w:r>
-        <w:rPr>
-          <w:rFonts w:ascii="Almendra" w:eastAsia="Arial" w:hAnsi="Almendra" w:cs="Arial"/>
-          <w:color w:val="000000"/>
-        </w:rPr>
-        <w:t>DoD</w:t>
-      </w:r>
-      <w:proofErr w:type="spellEnd"/>
-      <w:r>
-        <w:rPr>
-          <w:rFonts w:ascii="Almendra" w:eastAsia="Arial" w:hAnsi="Almendra" w:cs="Arial"/>
-          <w:color w:val="000000"/>
-        </w:rPr>
-        <w:t xml:space="preserve">: </w:t>
-      </w:r>
-      <w:proofErr w:type="spellStart"/>
-      <w:r>
-        <w:rPr>
-          <w:rFonts w:ascii="Almendra" w:eastAsia="Arial" w:hAnsi="Almendra" w:cs="Arial"/>
-          <w:color w:val="000000"/>
-        </w:rPr>
-        <w:t>Backend</w:t>
-      </w:r>
-      <w:proofErr w:type="spellEnd"/>
-      <w:r>
-        <w:rPr>
-          <w:rFonts w:ascii="Almendra" w:eastAsia="Arial" w:hAnsi="Almendra" w:cs="Arial"/>
-          <w:color w:val="000000"/>
-        </w:rPr>
-        <w:t xml:space="preserve"> poprawnie łączy się z bazą i wykonuje podstawowe operacje odczytu oraz zapisu akt).</w:t>
+        <w:t>Centralny rejestr w PostgreSQL. (DoD: Backend poprawnie łączy się z bazą i wykonuje podstawowe operacje odczytu oraz zapisu akt).</w:t>
       </w:r>
     </w:p>
     <w:p>
@@ -1465,23 +1234,7 @@
           <w:rFonts w:ascii="Almendra" w:eastAsia="Arial" w:hAnsi="Almendra" w:cs="Arial"/>
           <w:color w:val="000000"/>
         </w:rPr>
-        <w:t>Interfejs w języku Holy C. (</w:t>
-      </w:r>
-      <w:proofErr w:type="spellStart"/>
-      <w:r>
-        <w:rPr>
-          <w:rFonts w:ascii="Almendra" w:eastAsia="Arial" w:hAnsi="Almendra" w:cs="Arial"/>
-          <w:color w:val="000000"/>
-        </w:rPr>
-        <w:t>DoD</w:t>
-      </w:r>
-      <w:proofErr w:type="spellEnd"/>
-      <w:r>
-        <w:rPr>
-          <w:rFonts w:ascii="Almendra" w:eastAsia="Arial" w:hAnsi="Almendra" w:cs="Arial"/>
-          <w:color w:val="000000"/>
-        </w:rPr>
-        <w:t>: Interfejs w języku Holy C pozwala na wpisanie danych heretyka i pomyślne przesłanie ich na ołtarz serwera).</w:t>
+        <w:t>Interfejs w języku Holy C. (DoD: Interfejs w języku Holy C pozwala na wpisanie danych heretyka i pomyślne przesłanie ich na ołtarz serwera).</w:t>
       </w:r>
     </w:p>
     <w:p>
@@ -1557,27 +1310,7 @@
           <w:bCs/>
           <w:color w:val="000000"/>
         </w:rPr>
-        <w:t>5.1 Podstawowe funkcjonalności (</w:t>
-      </w:r>
-      <w:proofErr w:type="spellStart"/>
-      <w:r>
-        <w:rPr>
-          <w:rFonts w:ascii="Almendra" w:eastAsia="Arial" w:hAnsi="Almendra" w:cs="Arial"/>
-          <w:b/>
-          <w:bCs/>
-          <w:color w:val="000000"/>
-        </w:rPr>
-        <w:t>must-have</w:t>
-      </w:r>
-      <w:proofErr w:type="spellEnd"/>
-      <w:r>
-        <w:rPr>
-          <w:rFonts w:ascii="Almendra" w:eastAsia="Arial" w:hAnsi="Almendra" w:cs="Arial"/>
-          <w:b/>
-          <w:bCs/>
-          <w:color w:val="000000"/>
-        </w:rPr>
-        <w:t>):</w:t>
+        <w:t>5.1 Podstawowe funkcjonalności (must-have):</w:t>
       </w:r>
     </w:p>
     <w:tbl>
@@ -1924,27 +1657,7 @@
           <w:bCs/>
           <w:color w:val="000000"/>
         </w:rPr>
-        <w:t>5.2 Opcjonalne funkcjonalności (nice-to-</w:t>
-      </w:r>
-      <w:proofErr w:type="spellStart"/>
-      <w:r>
-        <w:rPr>
-          <w:rFonts w:ascii="Almendra" w:eastAsia="Arial" w:hAnsi="Almendra" w:cs="Arial"/>
-          <w:b/>
-          <w:bCs/>
-          <w:color w:val="000000"/>
-        </w:rPr>
-        <w:t>have</w:t>
-      </w:r>
-      <w:proofErr w:type="spellEnd"/>
-      <w:r>
-        <w:rPr>
-          <w:rFonts w:ascii="Almendra" w:eastAsia="Arial" w:hAnsi="Almendra" w:cs="Arial"/>
-          <w:b/>
-          <w:bCs/>
-          <w:color w:val="000000"/>
-        </w:rPr>
-        <w:t>):</w:t>
+        <w:t>5.2 Opcjonalne funkcjonalności (nice-to-have):</w:t>
       </w:r>
     </w:p>
     <w:tbl>
@@ -2396,23 +2109,7 @@
           <w:rFonts w:ascii="Almendra" w:eastAsia="Arial" w:hAnsi="Almendra" w:cs="Arial"/>
           <w:color w:val="000000"/>
         </w:rPr>
-        <w:t xml:space="preserve">Wykorzystanie relacyjnej bazy danych </w:t>
-      </w:r>
-      <w:proofErr w:type="spellStart"/>
-      <w:r>
-        <w:rPr>
-          <w:rFonts w:ascii="Almendra" w:eastAsia="Arial" w:hAnsi="Almendra" w:cs="Arial"/>
-          <w:color w:val="000000"/>
-        </w:rPr>
-        <w:t>PostgreSQL</w:t>
-      </w:r>
-      <w:proofErr w:type="spellEnd"/>
-      <w:r>
-        <w:rPr>
-          <w:rFonts w:ascii="Almendra" w:eastAsia="Arial" w:hAnsi="Almendra" w:cs="Arial"/>
-          <w:color w:val="000000"/>
-        </w:rPr>
-        <w:t>.</w:t>
+        <w:t>Wykorzystanie relacyjnej bazy danych PostgreSQL.</w:t>
       </w:r>
     </w:p>
     <w:p>
@@ -2461,21 +2158,12 @@
           <w:color w:val="000000"/>
         </w:rPr>
       </w:pPr>
-      <w:proofErr w:type="spellStart"/>
       <w:r>
         <w:rPr>
           <w:rFonts w:ascii="Almendra" w:hAnsi="Almendra" w:cs="Arial"/>
           <w:color w:val="000000"/>
         </w:rPr>
-        <w:t>Wieloplatformowość</w:t>
-      </w:r>
-      <w:proofErr w:type="spellEnd"/>
-      <w:r>
-        <w:rPr>
-          <w:rFonts w:ascii="Almendra" w:hAnsi="Almendra" w:cs="Arial"/>
-          <w:color w:val="000000"/>
-        </w:rPr>
-        <w:t xml:space="preserve"> systemu i jego pełna kompatybilność z systemami Windows oraz Linux.</w:t>
+        <w:t>Wieloplatformowość systemu i jego pełna kompatybilność z systemami Windows oraz Linux.</w:t>
       </w:r>
     </w:p>
     <w:p>
@@ -2856,27 +2544,7 @@
                 <w:sz w:val="24"/>
                 <w:szCs w:val="24"/>
               </w:rPr>
-              <w:t xml:space="preserve">Konfiguracja szkieletu serwera w Javie i bazy </w:t>
-            </w:r>
-            <w:proofErr w:type="spellStart"/>
-            <w:r>
-              <w:rPr>
-                <w:rFonts w:ascii="Almendra" w:eastAsia="Arial" w:hAnsi="Almendra" w:cs="Arial"/>
-                <w:color w:val="000000"/>
-                <w:sz w:val="24"/>
-                <w:szCs w:val="24"/>
-              </w:rPr>
-              <w:t>PostgreSQL</w:t>
-            </w:r>
-            <w:proofErr w:type="spellEnd"/>
-            <w:r>
-              <w:rPr>
-                <w:rFonts w:ascii="Almendra" w:eastAsia="Arial" w:hAnsi="Almendra" w:cs="Arial"/>
-                <w:color w:val="000000"/>
-                <w:sz w:val="24"/>
-                <w:szCs w:val="24"/>
-              </w:rPr>
-              <w:t xml:space="preserve">. </w:t>
+              <w:t xml:space="preserve">Konfiguracja szkieletu serwera w Javie i bazy PostgreSQL. </w:t>
             </w:r>
           </w:p>
         </w:tc>
@@ -3034,27 +2702,7 @@
                 <w:sz w:val="24"/>
                 <w:szCs w:val="24"/>
               </w:rPr>
-              <w:t xml:space="preserve">Prace nad podstawowym interfejsem użytkownika we </w:t>
-            </w:r>
-            <w:proofErr w:type="spellStart"/>
-            <w:r>
-              <w:rPr>
-                <w:rFonts w:ascii="Almendra" w:eastAsia="Arial" w:hAnsi="Almendra" w:cs="Arial"/>
-                <w:color w:val="000000"/>
-                <w:sz w:val="24"/>
-                <w:szCs w:val="24"/>
-              </w:rPr>
-              <w:t>frontendzie</w:t>
-            </w:r>
-            <w:proofErr w:type="spellEnd"/>
-            <w:r>
-              <w:rPr>
-                <w:rFonts w:ascii="Almendra" w:eastAsia="Arial" w:hAnsi="Almendra" w:cs="Arial"/>
-                <w:color w:val="000000"/>
-                <w:sz w:val="24"/>
-                <w:szCs w:val="24"/>
-              </w:rPr>
-              <w:t xml:space="preserve">. </w:t>
+              <w:t xml:space="preserve">Prace nad podstawowym interfejsem użytkownika we frontendzie. </w:t>
             </w:r>
           </w:p>
         </w:tc>
@@ -3133,27 +2781,7 @@
                 <w:sz w:val="24"/>
                 <w:szCs w:val="24"/>
               </w:rPr>
-              <w:t>Tworzenie punktów końcowych (</w:t>
-            </w:r>
-            <w:proofErr w:type="spellStart"/>
-            <w:r>
-              <w:rPr>
-                <w:rFonts w:ascii="Almendra" w:eastAsia="Arial" w:hAnsi="Almendra" w:cs="Arial"/>
-                <w:color w:val="000000"/>
-                <w:sz w:val="24"/>
-                <w:szCs w:val="24"/>
-              </w:rPr>
-              <w:t>endpointów</w:t>
-            </w:r>
-            <w:proofErr w:type="spellEnd"/>
-            <w:r>
-              <w:rPr>
-                <w:rFonts w:ascii="Almendra" w:eastAsia="Arial" w:hAnsi="Almendra" w:cs="Arial"/>
-                <w:color w:val="000000"/>
-                <w:sz w:val="24"/>
-                <w:szCs w:val="24"/>
-              </w:rPr>
-              <w:t>/gniazd) po stronie serwera Java.</w:t>
+              <w:t>Tworzenie punktów końcowych (endpointów/gniazd) po stronie serwera Java.</w:t>
             </w:r>
           </w:p>
         </w:tc>
@@ -3232,27 +2860,7 @@
                 <w:sz w:val="24"/>
                 <w:szCs w:val="24"/>
               </w:rPr>
-              <w:t xml:space="preserve">Próby zestawienia komunikacji sieciowej między </w:t>
-            </w:r>
-            <w:proofErr w:type="spellStart"/>
-            <w:r>
-              <w:rPr>
-                <w:rFonts w:ascii="Almendra" w:eastAsia="Arial" w:hAnsi="Almendra" w:cs="Arial"/>
-                <w:color w:val="000000"/>
-                <w:sz w:val="24"/>
-                <w:szCs w:val="24"/>
-              </w:rPr>
-              <w:t>Frontendem</w:t>
-            </w:r>
-            <w:proofErr w:type="spellEnd"/>
-            <w:r>
-              <w:rPr>
-                <w:rFonts w:ascii="Almendra" w:eastAsia="Arial" w:hAnsi="Almendra" w:cs="Arial"/>
-                <w:color w:val="000000"/>
-                <w:sz w:val="24"/>
-                <w:szCs w:val="24"/>
-              </w:rPr>
-              <w:t xml:space="preserve"> a Javą. </w:t>
+              <w:t xml:space="preserve">Próby zestawienia komunikacji sieciowej między Frontendem a Javą. </w:t>
             </w:r>
           </w:p>
         </w:tc>
@@ -3595,20 +3203,31 @@
               <w:spacing w:after="0" w:line="240" w:lineRule="auto"/>
               <w:jc w:val="both"/>
               <w:rPr>
-                <w:rFonts w:ascii="Almendra" w:eastAsia="Arial" w:hAnsi="Almendra" w:cs="Arial"/>
-                <w:color w:val="000000"/>
-                <w:sz w:val="24"/>
-                <w:szCs w:val="24"/>
-              </w:rPr>
-            </w:pPr>
-            <w:r>
-              <w:rPr>
-                <w:rFonts w:ascii="Almendra" w:eastAsia="Arial" w:hAnsi="Almendra" w:cs="Arial"/>
-                <w:color w:val="000000"/>
-                <w:sz w:val="24"/>
-                <w:szCs w:val="24"/>
-              </w:rPr>
-              <w:t>21.12.2027</w:t>
+                <w:rFonts w:asciiTheme="minorHAnsi" w:eastAsia="Arial" w:hAnsiTheme="minorHAnsi" w:cs="Arial"/>
+                <w:color w:val="000000"/>
+                <w:sz w:val="24"/>
+                <w:szCs w:val="24"/>
+                <w:lang w:val="uk-UA"/>
+              </w:rPr>
+            </w:pPr>
+            <w:r>
+              <w:rPr>
+                <w:rFonts w:ascii="Almendra" w:eastAsia="Arial" w:hAnsi="Almendra" w:cs="Arial"/>
+                <w:color w:val="000000"/>
+                <w:sz w:val="24"/>
+                <w:szCs w:val="24"/>
+              </w:rPr>
+              <w:t>21.12.202</w:t>
+            </w:r>
+            <w:r>
+              <w:rPr>
+                <w:rFonts w:asciiTheme="minorHAnsi" w:eastAsia="Arial" w:hAnsiTheme="minorHAnsi" w:cs="Arial"/>
+                <w:color w:val="000000"/>
+                <w:sz w:val="24"/>
+                <w:szCs w:val="24"/>
+                <w:lang w:val="uk-UA"/>
+              </w:rPr>
+              <w:t>6</w:t>
             </w:r>
           </w:p>
         </w:tc>
@@ -3726,27 +3345,7 @@
                 <w:sz w:val="24"/>
                 <w:szCs w:val="24"/>
               </w:rPr>
-              <w:t xml:space="preserve">Ostateczne testy, </w:t>
-            </w:r>
-            <w:proofErr w:type="spellStart"/>
-            <w:r>
-              <w:rPr>
-                <w:rFonts w:ascii="Almendra" w:eastAsia="Arial" w:hAnsi="Almendra" w:cs="Arial"/>
-                <w:color w:val="000000"/>
-                <w:sz w:val="24"/>
-                <w:szCs w:val="24"/>
-              </w:rPr>
-              <w:t>refaktoryzacja</w:t>
-            </w:r>
-            <w:proofErr w:type="spellEnd"/>
-            <w:r>
-              <w:rPr>
-                <w:rFonts w:ascii="Almendra" w:eastAsia="Arial" w:hAnsi="Almendra" w:cs="Arial"/>
-                <w:color w:val="000000"/>
-                <w:sz w:val="24"/>
-                <w:szCs w:val="24"/>
-              </w:rPr>
-              <w:t xml:space="preserve"> i przygotowanie dokumentacji. </w:t>
+              <w:t xml:space="preserve">Ostateczne testy, refaktoryzacja i przygotowanie dokumentacji. </w:t>
             </w:r>
           </w:p>
         </w:tc>
@@ -4038,21 +3637,8 @@
           <w:sz w:val="24"/>
           <w:szCs w:val="24"/>
         </w:rPr>
-        <w:t xml:space="preserve">8.1 Identyfikacja </w:t>
+        <w:t>8.1 Identyfikacja ryzyk</w:t>
       </w:r>
-      <w:proofErr w:type="spellStart"/>
-      <w:r>
-        <w:rPr>
-          <w:rFonts w:ascii="Almendra" w:eastAsia="Arial" w:hAnsi="Almendra" w:cs="Arial"/>
-          <w:b/>
-          <w:bCs/>
-          <w:color w:val="000000"/>
-          <w:sz w:val="24"/>
-          <w:szCs w:val="24"/>
-        </w:rPr>
-        <w:t>ryzyk</w:t>
-      </w:r>
-      <w:proofErr w:type="spellEnd"/>
     </w:p>
     <w:p>
       <w:pPr>
@@ -4105,23 +3691,7 @@
           <w:rFonts w:ascii="Almendra" w:eastAsia="Arial" w:hAnsi="Almendra" w:cs="Arial"/>
           <w:color w:val="000000"/>
         </w:rPr>
-        <w:t xml:space="preserve">Brak zewnętrznych bibliotek i obszernych poradników do rozwiązywania problemów we </w:t>
-      </w:r>
-      <w:proofErr w:type="spellStart"/>
-      <w:r>
-        <w:rPr>
-          <w:rFonts w:ascii="Almendra" w:eastAsia="Arial" w:hAnsi="Almendra" w:cs="Arial"/>
-          <w:color w:val="000000"/>
-        </w:rPr>
-        <w:t>frontendzie</w:t>
-      </w:r>
-      <w:proofErr w:type="spellEnd"/>
-      <w:r>
-        <w:rPr>
-          <w:rFonts w:ascii="Almendra" w:eastAsia="Arial" w:hAnsi="Almendra" w:cs="Arial"/>
-          <w:color w:val="000000"/>
-        </w:rPr>
-        <w:t>.</w:t>
+        <w:t>Brak zewnętrznych bibliotek i obszernych poradników do rozwiązywania problemów we frontendzie.</w:t>
       </w:r>
     </w:p>
     <w:p>
@@ -4198,27 +3768,7 @@
           <w:sz w:val="24"/>
           <w:szCs w:val="24"/>
         </w:rPr>
-        <w:t xml:space="preserve">Szybkie stworzenie najprostszego prototypu (Proof of </w:t>
-      </w:r>
-      <w:proofErr w:type="spellStart"/>
-      <w:r>
-        <w:rPr>
-          <w:rFonts w:ascii="Almendra" w:eastAsia="Arial" w:hAnsi="Almendra" w:cs="Arial"/>
-          <w:color w:val="000000"/>
-          <w:sz w:val="24"/>
-          <w:szCs w:val="24"/>
-        </w:rPr>
-        <w:t>Concept</w:t>
-      </w:r>
-      <w:proofErr w:type="spellEnd"/>
-      <w:r>
-        <w:rPr>
-          <w:rFonts w:ascii="Almendra" w:eastAsia="Arial" w:hAnsi="Almendra" w:cs="Arial"/>
-          <w:color w:val="000000"/>
-          <w:sz w:val="24"/>
-          <w:szCs w:val="24"/>
-        </w:rPr>
-        <w:t>) komunikacji między Javą a Holy C, aby upewnić się o wykonalności zadania, zanim powstaną zaawansowane moduły.</w:t>
+        <w:t>Szybkie stworzenie najprostszego prototypu (Proof of Concept) komunikacji między Javą a Holy C, aby upewnić się o wykonalności zadania, zanim powstaną zaawansowane moduły.</w:t>
       </w:r>
     </w:p>
     <w:p>
@@ -4297,27 +3847,7 @@
           <w:bCs/>
           <w:color w:val="000000"/>
         </w:rPr>
-        <w:t>9.1 Dokumentacja techniczna (</w:t>
-      </w:r>
-      <w:proofErr w:type="spellStart"/>
-      <w:r>
-        <w:rPr>
-          <w:rFonts w:ascii="Almendra" w:eastAsia="Arial" w:hAnsi="Almendra" w:cs="Arial"/>
-          <w:b/>
-          <w:bCs/>
-          <w:color w:val="000000"/>
-        </w:rPr>
-        <w:t>Doxygen</w:t>
-      </w:r>
-      <w:proofErr w:type="spellEnd"/>
-      <w:r>
-        <w:rPr>
-          <w:rFonts w:ascii="Almendra" w:eastAsia="Arial" w:hAnsi="Almendra" w:cs="Arial"/>
-          <w:b/>
-          <w:bCs/>
-          <w:color w:val="000000"/>
-        </w:rPr>
-        <w:t>)</w:t>
+        <w:t>9.1 Dokumentacja techniczna (Doxygen)</w:t>
       </w:r>
     </w:p>
     <w:p>
@@ -4522,37 +4052,8 @@
             <w:sz w:val="24"/>
             <w:szCs w:val="24"/>
           </w:rPr>
-          <w:t>d</w:t>
+          <w:t>do Jiry</w:t>
         </w:r>
-        <w:r>
-          <w:rPr>
-            <w:rStyle w:val="Hyperlink"/>
-            <w:rFonts w:ascii="Almendra" w:eastAsia="Arial" w:hAnsi="Almendra" w:cs="Arial"/>
-            <w:sz w:val="24"/>
-            <w:szCs w:val="24"/>
-          </w:rPr>
-          <w:t>o</w:t>
-        </w:r>
-        <w:r>
-          <w:rPr>
-            <w:rStyle w:val="Hyperlink"/>
-            <w:rFonts w:ascii="Almendra" w:eastAsia="Arial" w:hAnsi="Almendra" w:cs="Arial"/>
-            <w:sz w:val="24"/>
-            <w:szCs w:val="24"/>
-          </w:rPr>
-          <w:t xml:space="preserve"> </w:t>
-        </w:r>
-        <w:proofErr w:type="spellStart"/>
-        <w:r>
-          <w:rPr>
-            <w:rStyle w:val="Hyperlink"/>
-            <w:rFonts w:ascii="Almendra" w:eastAsia="Arial" w:hAnsi="Almendra" w:cs="Arial"/>
-            <w:sz w:val="24"/>
-            <w:szCs w:val="24"/>
-          </w:rPr>
-          <w:t>Jiry</w:t>
-        </w:r>
-        <w:proofErr w:type="spellEnd"/>
       </w:hyperlink>
     </w:p>
     <w:p>
@@ -4740,7 +4241,7 @@
             </wp:anchor>
           </w:drawing>
         </mc:Choice>
-        <mc:Fallback xmlns:cr="http://schemas.microsoft.com/office/comments/2020/reactions" xmlns="http://schemas.microsoft.com/office/tasks/2019/documenttasks" xmlns:dgm="http://schemas.openxmlformats.org/drawingml/2006/diagram" xmlns:lc="http://schemas.openxmlformats.org/drawingml/2006/lockedCanvas" xmlns:c="http://schemas.openxmlformats.org/drawingml/2006/chart" xmlns:pic="http://schemas.openxmlformats.org/drawingml/2006/picture" xmlns:a="http://schemas.openxmlformats.org/drawingml/2006/main" xmlns:sl="http://schemas.openxmlformats.org/schemaLibrary/2006/main">
+        <mc:Fallback xmlns:sl="http://schemas.openxmlformats.org/schemaLibrary/2006/main" xmlns:a="http://schemas.openxmlformats.org/drawingml/2006/main" xmlns:pic="http://schemas.openxmlformats.org/drawingml/2006/picture" xmlns:c="http://schemas.openxmlformats.org/drawingml/2006/chart" xmlns:lc="http://schemas.openxmlformats.org/drawingml/2006/lockedCanvas" xmlns:dgm="http://schemas.openxmlformats.org/drawingml/2006/diagram" xmlns="http://schemas.microsoft.com/office/tasks/2019/documenttasks" xmlns:cr="http://schemas.microsoft.com/office/comments/2020/reactions">
           <w:drawing>
             <wp:anchor allowOverlap="1" behindDoc="1" distB="0" distT="0" distL="0" distR="0" hidden="0" layoutInCell="1" locked="0" relativeHeight="0" simplePos="0">
               <wp:simplePos x="0" y="0"/>
@@ -4858,7 +4359,7 @@
             </wp:anchor>
           </w:drawing>
         </mc:Choice>
-        <mc:Fallback xmlns:cr="http://schemas.microsoft.com/office/comments/2020/reactions" xmlns="http://schemas.microsoft.com/office/tasks/2019/documenttasks" xmlns:dgm="http://schemas.openxmlformats.org/drawingml/2006/diagram" xmlns:lc="http://schemas.openxmlformats.org/drawingml/2006/lockedCanvas" xmlns:c="http://schemas.openxmlformats.org/drawingml/2006/chart" xmlns:pic="http://schemas.openxmlformats.org/drawingml/2006/picture" xmlns:a="http://schemas.openxmlformats.org/drawingml/2006/main" xmlns:sl="http://schemas.openxmlformats.org/schemaLibrary/2006/main">
+        <mc:Fallback xmlns:sl="http://schemas.openxmlformats.org/schemaLibrary/2006/main" xmlns:a="http://schemas.openxmlformats.org/drawingml/2006/main" xmlns:pic="http://schemas.openxmlformats.org/drawingml/2006/picture" xmlns:c="http://schemas.openxmlformats.org/drawingml/2006/chart" xmlns:lc="http://schemas.openxmlformats.org/drawingml/2006/lockedCanvas" xmlns:dgm="http://schemas.openxmlformats.org/drawingml/2006/diagram" xmlns="http://schemas.microsoft.com/office/tasks/2019/documenttasks" xmlns:cr="http://schemas.microsoft.com/office/comments/2020/reactions">
           <w:drawing>
             <wp:anchor allowOverlap="1" behindDoc="1" distB="0" distT="0" distL="0" distR="0" hidden="0" layoutInCell="1" locked="0" relativeHeight="0" simplePos="0">
               <wp:simplePos x="0" y="0"/>
@@ -5066,7 +4567,7 @@
             </wp:anchor>
           </w:drawing>
         </mc:Choice>
-        <mc:Fallback xmlns:cr="http://schemas.microsoft.com/office/comments/2020/reactions" xmlns="http://schemas.microsoft.com/office/tasks/2019/documenttasks" xmlns:dgm="http://schemas.openxmlformats.org/drawingml/2006/diagram" xmlns:lc="http://schemas.openxmlformats.org/drawingml/2006/lockedCanvas" xmlns:c="http://schemas.openxmlformats.org/drawingml/2006/chart" xmlns:pic="http://schemas.openxmlformats.org/drawingml/2006/picture" xmlns:a="http://schemas.openxmlformats.org/drawingml/2006/main" xmlns:sl="http://schemas.openxmlformats.org/schemaLibrary/2006/main">
+        <mc:Fallback xmlns:sl="http://schemas.openxmlformats.org/schemaLibrary/2006/main" xmlns:a="http://schemas.openxmlformats.org/drawingml/2006/main" xmlns:pic="http://schemas.openxmlformats.org/drawingml/2006/picture" xmlns:c="http://schemas.openxmlformats.org/drawingml/2006/chart" xmlns:lc="http://schemas.openxmlformats.org/drawingml/2006/lockedCanvas" xmlns:dgm="http://schemas.openxmlformats.org/drawingml/2006/diagram" xmlns="http://schemas.microsoft.com/office/tasks/2019/documenttasks" xmlns:cr="http://schemas.microsoft.com/office/comments/2020/reactions">
           <w:drawing>
             <wp:anchor allowOverlap="1" behindDoc="1" distB="0" distT="0" distL="0" distR="0" hidden="0" layoutInCell="1" locked="0" relativeHeight="0" simplePos="0">
               <wp:simplePos x="0" y="0"/>
@@ -5226,7 +4727,7 @@
             </wp:anchor>
           </w:drawing>
         </mc:Choice>
-        <mc:Fallback xmlns:cr="http://schemas.microsoft.com/office/comments/2020/reactions" xmlns="http://schemas.microsoft.com/office/tasks/2019/documenttasks" xmlns:dgm="http://schemas.openxmlformats.org/drawingml/2006/diagram" xmlns:lc="http://schemas.openxmlformats.org/drawingml/2006/lockedCanvas" xmlns:c="http://schemas.openxmlformats.org/drawingml/2006/chart" xmlns:pic="http://schemas.openxmlformats.org/drawingml/2006/picture" xmlns:a="http://schemas.openxmlformats.org/drawingml/2006/main" xmlns:sl="http://schemas.openxmlformats.org/schemaLibrary/2006/main">
+        <mc:Fallback xmlns:sl="http://schemas.openxmlformats.org/schemaLibrary/2006/main" xmlns:a="http://schemas.openxmlformats.org/drawingml/2006/main" xmlns:pic="http://schemas.openxmlformats.org/drawingml/2006/picture" xmlns:c="http://schemas.openxmlformats.org/drawingml/2006/chart" xmlns:lc="http://schemas.openxmlformats.org/drawingml/2006/lockedCanvas" xmlns:dgm="http://schemas.openxmlformats.org/drawingml/2006/diagram" xmlns="http://schemas.microsoft.com/office/tasks/2019/documenttasks" xmlns:cr="http://schemas.microsoft.com/office/comments/2020/reactions">
           <w:drawing>
             <wp:anchor allowOverlap="1" behindDoc="1" distB="0" distT="0" distL="0" distR="0" hidden="0" layoutInCell="1" locked="0" relativeHeight="0" simplePos="0">
               <wp:simplePos x="0" y="0"/>
@@ -6151,6 +5652,7 @@
   <w:style w:type="character" w:default="1" w:styleId="DefaultParagraphFont">
     <w:name w:val="Default Paragraph Font"/>
     <w:uiPriority w:val="1"/>
+    <w:semiHidden/>
     <w:unhideWhenUsed/>
   </w:style>
   <w:style w:type="table" w:default="1" w:styleId="TableNormal">

</xml_diff>

<commit_message>
ICMSSI-1 #done fix/ICMSSI-1-must-docs: Update document date in Project_IO_1 specification
</commit_message>
<xml_diff>
--- a/docs/Project_IO_1.docx
+++ b/docs/Project_IO_1.docx
@@ -759,7 +759,6 @@
                 <w:lang w:val="en-US"/>
               </w:rPr>
             </w:pPr>
-            <w:proofErr w:type="spellStart"/>
             <w:r>
               <w:rPr>
                 <w:rFonts w:ascii="Almendra" w:eastAsia="Arial" w:hAnsi="Almendra" w:cs="Arial"/>
@@ -769,7 +768,6 @@
               </w:rPr>
               <w:t>FullStack</w:t>
             </w:r>
-            <w:proofErr w:type="spellEnd"/>
             <w:r>
               <w:rPr>
                 <w:rFonts w:ascii="Almendra" w:eastAsia="Arial" w:hAnsi="Almendra" w:cs="Arial"/>
@@ -827,19 +825,8 @@
                 <w:sz w:val="24"/>
                 <w:szCs w:val="24"/>
               </w:rPr>
-              <w:t xml:space="preserve">Roman </w:t>
-            </w:r>
-            <w:proofErr w:type="spellStart"/>
-            <w:r>
-              <w:rPr>
-                <w:rFonts w:ascii="Almendra" w:eastAsia="Arial" w:hAnsi="Almendra" w:cs="Arial"/>
-                <w:color w:val="000000"/>
-                <w:sz w:val="24"/>
-                <w:szCs w:val="24"/>
-              </w:rPr>
-              <w:t>Potapov</w:t>
-            </w:r>
-            <w:proofErr w:type="spellEnd"/>
+              <w:t>Roman Potapov</w:t>
+            </w:r>
           </w:p>
         </w:tc>
         <w:tc>
@@ -870,7 +857,6 @@
                 <w:szCs w:val="24"/>
               </w:rPr>
             </w:pPr>
-            <w:proofErr w:type="spellStart"/>
             <w:r>
               <w:rPr>
                 <w:rFonts w:ascii="Almendra" w:eastAsia="Arial" w:hAnsi="Almendra" w:cs="Arial"/>
@@ -880,7 +866,6 @@
               </w:rPr>
               <w:t>Backend</w:t>
             </w:r>
-            <w:proofErr w:type="spellEnd"/>
           </w:p>
         </w:tc>
       </w:tr>
@@ -912,37 +897,15 @@
                 <w:szCs w:val="24"/>
               </w:rPr>
             </w:pPr>
-            <w:proofErr w:type="spellStart"/>
-            <w:r>
-              <w:rPr>
-                <w:rFonts w:ascii="Almendra" w:eastAsia="Arial" w:hAnsi="Almendra" w:cs="Arial"/>
-                <w:color w:val="000000"/>
-                <w:sz w:val="24"/>
-                <w:szCs w:val="24"/>
-              </w:rPr>
-              <w:t>Yehor</w:t>
-            </w:r>
-            <w:proofErr w:type="spellEnd"/>
-            <w:r>
-              <w:rPr>
-                <w:rFonts w:ascii="Almendra" w:eastAsia="Arial" w:hAnsi="Almendra" w:cs="Arial"/>
-                <w:color w:val="000000"/>
-                <w:sz w:val="24"/>
-                <w:szCs w:val="24"/>
-              </w:rPr>
-              <w:t xml:space="preserve"> </w:t>
-            </w:r>
-            <w:proofErr w:type="spellStart"/>
-            <w:r>
-              <w:rPr>
-                <w:rFonts w:ascii="Almendra" w:eastAsia="Arial" w:hAnsi="Almendra" w:cs="Arial"/>
-                <w:color w:val="000000"/>
-                <w:sz w:val="24"/>
-                <w:szCs w:val="24"/>
-              </w:rPr>
-              <w:t>Zaivenko</w:t>
-            </w:r>
-            <w:proofErr w:type="spellEnd"/>
+            <w:r>
+              <w:rPr>
+                <w:rFonts w:ascii="Almendra" w:eastAsia="Arial" w:hAnsi="Almendra" w:cs="Arial"/>
+                <w:color w:val="000000"/>
+                <w:sz w:val="24"/>
+                <w:szCs w:val="24"/>
+              </w:rPr>
+              <w:t>Yehor Zaivenko</w:t>
+            </w:r>
           </w:p>
         </w:tc>
         <w:tc>
@@ -973,7 +936,6 @@
                 <w:szCs w:val="24"/>
               </w:rPr>
             </w:pPr>
-            <w:proofErr w:type="spellStart"/>
             <w:r>
               <w:rPr>
                 <w:rFonts w:ascii="Almendra" w:eastAsia="Arial" w:hAnsi="Almendra" w:cs="Arial"/>
@@ -983,7 +945,6 @@
               </w:rPr>
               <w:t>Frontend</w:t>
             </w:r>
-            <w:proofErr w:type="spellEnd"/>
           </w:p>
         </w:tc>
       </w:tr>
@@ -1066,9 +1027,8 @@
           <w:sz w:val="24"/>
           <w:szCs w:val="24"/>
         </w:rPr>
-        <w:t xml:space="preserve">Projekt zakłada stworzenie rozproszonego systemu informatycznego w architekturze klient-serwer, służącego do ewidencjonowania tajnych akt sądowymi. Ponieważ nikt nie spodziewa się Hiszpańskiej Inkwizycji, system musi działać szybko i bezwzględnie. Aplikacja kliencka zostanie napisana w boskim języku Holy C, natomiast </w:t>
+        <w:t xml:space="preserve">Projekt zakłada stworzenie rozproszonego systemu informatycznego w architekturze klient-serwer, służącego do ewidencjonowania tajnych akt sądowymi. Ponieważ nikt nie spodziewa się Hiszpańskiej Inkwizycji, system musi działać szybko i bezwzględnie. Aplikacja kliencka zostanie napisana w boskim języku Holy C, natomiast backend - pełniący rolę Głównego Inkwizytora logiki biznesowej - w języku Java, przechowując dane o grzechach w bazie PostgreSQL. </w:t>
       </w:r>
-      <w:proofErr w:type="spellStart"/>
       <w:r>
         <w:rPr>
           <w:rFonts w:ascii="Almendra" w:eastAsia="Arial" w:hAnsi="Almendra" w:cs="Arial"/>
@@ -1076,86 +1036,7 @@
           <w:sz w:val="24"/>
           <w:szCs w:val="24"/>
         </w:rPr>
-        <w:t>backend</w:t>
-      </w:r>
-      <w:proofErr w:type="spellEnd"/>
-      <w:r>
-        <w:rPr>
-          <w:rFonts w:ascii="Almendra" w:eastAsia="Arial" w:hAnsi="Almendra" w:cs="Arial"/>
-          <w:color w:val="000000"/>
-          <w:sz w:val="24"/>
-          <w:szCs w:val="24"/>
-        </w:rPr>
-        <w:t xml:space="preserve"> - pełniący rolę Głównego Inkwizytora logiki biznesowej - w języku Java, przechowując dane o grzechach w bazie </w:t>
-      </w:r>
-      <w:proofErr w:type="spellStart"/>
-      <w:r>
-        <w:rPr>
-          <w:rFonts w:ascii="Almendra" w:eastAsia="Arial" w:hAnsi="Almendra" w:cs="Arial"/>
-          <w:color w:val="000000"/>
-          <w:sz w:val="24"/>
-          <w:szCs w:val="24"/>
-        </w:rPr>
-        <w:t>PostgreSQL</w:t>
-      </w:r>
-      <w:proofErr w:type="spellEnd"/>
-      <w:r>
-        <w:rPr>
-          <w:rFonts w:ascii="Almendra" w:eastAsia="Arial" w:hAnsi="Almendra" w:cs="Arial"/>
-          <w:color w:val="000000"/>
-          <w:sz w:val="24"/>
-          <w:szCs w:val="24"/>
-        </w:rPr>
-        <w:t xml:space="preserve">. </w:t>
-      </w:r>
-      <w:r>
-        <w:rPr>
-          <w:rFonts w:ascii="Almendra" w:eastAsia="Arial" w:hAnsi="Almendra" w:cs="Arial"/>
-          <w:color w:val="000000"/>
-          <w:sz w:val="24"/>
-          <w:szCs w:val="24"/>
-        </w:rPr>
-        <w:t xml:space="preserve">System jest rozwijany z myślą o natywnym wsparciu dla systemów Windows oraz Linux, z zachowaniem </w:t>
-      </w:r>
-      <w:proofErr w:type="spellStart"/>
-      <w:r>
-        <w:rPr>
-          <w:rFonts w:ascii="Almendra" w:eastAsia="Arial" w:hAnsi="Almendra" w:cs="Arial"/>
-          <w:color w:val="000000"/>
-          <w:sz w:val="24"/>
-          <w:szCs w:val="24"/>
-        </w:rPr>
-        <w:t>wieloplatformowości</w:t>
-      </w:r>
-      <w:proofErr w:type="spellEnd"/>
-      <w:r>
-        <w:rPr>
-          <w:rFonts w:ascii="Almendra" w:eastAsia="Arial" w:hAnsi="Almendra" w:cs="Arial"/>
-          <w:color w:val="000000"/>
-          <w:sz w:val="24"/>
-          <w:szCs w:val="24"/>
-        </w:rPr>
-        <w:t xml:space="preserve"> kodu (ewentualne wsparcie dla </w:t>
-      </w:r>
-      <w:proofErr w:type="spellStart"/>
-      <w:r>
-        <w:rPr>
-          <w:rFonts w:ascii="Almendra" w:eastAsia="Arial" w:hAnsi="Almendra" w:cs="Arial"/>
-          <w:color w:val="000000"/>
-          <w:sz w:val="24"/>
-          <w:szCs w:val="24"/>
-        </w:rPr>
-        <w:t>macOS</w:t>
-      </w:r>
-      <w:proofErr w:type="spellEnd"/>
-      <w:r>
-        <w:rPr>
-          <w:rFonts w:ascii="Almendra" w:eastAsia="Arial" w:hAnsi="Almendra" w:cs="Arial"/>
-          <w:color w:val="000000"/>
-          <w:sz w:val="24"/>
-          <w:szCs w:val="24"/>
-        </w:rPr>
-        <w:t xml:space="preserve"> planowane w późniejszym etapie).</w:t>
+        <w:t>System jest rozwijany z myślą o natywnym wsparciu dla systemów Windows oraz Linux, z zachowaniem wieloplatformowości kodu (ewentualne wsparcie dla macOS planowane w późniejszym etapie).</w:t>
       </w:r>
     </w:p>
     <w:p>
@@ -1272,55 +1153,7 @@
           <w:sz w:val="18"/>
           <w:szCs w:val="18"/>
         </w:rPr>
-        <w:t xml:space="preserve">(dla każdego założenia/zadania stworzyć </w:t>
-      </w:r>
-      <w:proofErr w:type="spellStart"/>
-      <w:r>
-        <w:rPr>
-          <w:rFonts w:ascii="Almendra" w:eastAsia="Arial" w:hAnsi="Almendra" w:cs="Arial"/>
-          <w:b/>
-          <w:bCs/>
-          <w:color w:val="000000"/>
-          <w:sz w:val="18"/>
-          <w:szCs w:val="18"/>
-        </w:rPr>
-        <w:t>DoD</w:t>
-      </w:r>
-      <w:proofErr w:type="spellEnd"/>
-      <w:r>
-        <w:rPr>
-          <w:rFonts w:ascii="Almendra" w:eastAsia="Arial" w:hAnsi="Almendra" w:cs="Arial"/>
-          <w:b/>
-          <w:bCs/>
-          <w:color w:val="000000"/>
-          <w:sz w:val="18"/>
-          <w:szCs w:val="18"/>
-        </w:rPr>
-        <w:t xml:space="preserve"> (Definition of </w:t>
-      </w:r>
-      <w:proofErr w:type="spellStart"/>
-      <w:r>
-        <w:rPr>
-          <w:rFonts w:ascii="Almendra" w:eastAsia="Arial" w:hAnsi="Almendra" w:cs="Arial"/>
-          <w:b/>
-          <w:bCs/>
-          <w:color w:val="000000"/>
-          <w:sz w:val="18"/>
-          <w:szCs w:val="18"/>
-        </w:rPr>
-        <w:t>Done</w:t>
-      </w:r>
-      <w:proofErr w:type="spellEnd"/>
-      <w:r>
-        <w:rPr>
-          <w:rFonts w:ascii="Almendra" w:eastAsia="Arial" w:hAnsi="Almendra" w:cs="Arial"/>
-          <w:b/>
-          <w:bCs/>
-          <w:color w:val="000000"/>
-          <w:sz w:val="18"/>
-          <w:szCs w:val="18"/>
-        </w:rPr>
-        <w:t>)</w:t>
+        <w:t>(dla każdego założenia/zadania stworzyć DoD (Definition of Done)</w:t>
       </w:r>
     </w:p>
     <w:p>
@@ -1347,23 +1180,7 @@
           <w:rFonts w:ascii="Almendra" w:eastAsia="Arial" w:hAnsi="Almendra" w:cs="Arial"/>
           <w:color w:val="000000"/>
         </w:rPr>
-        <w:t>Architektura klient-serwer. (</w:t>
-      </w:r>
-      <w:proofErr w:type="spellStart"/>
-      <w:r>
-        <w:rPr>
-          <w:rFonts w:ascii="Almendra" w:eastAsia="Arial" w:hAnsi="Almendra" w:cs="Arial"/>
-          <w:color w:val="000000"/>
-        </w:rPr>
-        <w:t>DoD</w:t>
-      </w:r>
-      <w:proofErr w:type="spellEnd"/>
-      <w:r>
-        <w:rPr>
-          <w:rFonts w:ascii="Almendra" w:eastAsia="Arial" w:hAnsi="Almendra" w:cs="Arial"/>
-          <w:color w:val="000000"/>
-        </w:rPr>
-        <w:t>: Serwer Java i klient w Holy C potrafią nawiązać poprawne połączenie i wymieniać dane o sprawach).</w:t>
+        <w:t>Architektura klient-serwer. (DoD: Serwer Java i klient w Holy C potrafią nawiązać poprawne połączenie i wymieniać dane o sprawach).</w:t>
       </w:r>
     </w:p>
     <w:p>
@@ -1390,55 +1207,7 @@
           <w:rFonts w:ascii="Almendra" w:eastAsia="Arial" w:hAnsi="Almendra" w:cs="Arial"/>
           <w:color w:val="000000"/>
         </w:rPr>
-        <w:t xml:space="preserve">Centralny rejestr w </w:t>
-      </w:r>
-      <w:proofErr w:type="spellStart"/>
-      <w:r>
-        <w:rPr>
-          <w:rFonts w:ascii="Almendra" w:eastAsia="Arial" w:hAnsi="Almendra" w:cs="Arial"/>
-          <w:color w:val="000000"/>
-        </w:rPr>
-        <w:t>PostgreSQL</w:t>
-      </w:r>
-      <w:proofErr w:type="spellEnd"/>
-      <w:r>
-        <w:rPr>
-          <w:rFonts w:ascii="Almendra" w:eastAsia="Arial" w:hAnsi="Almendra" w:cs="Arial"/>
-          <w:color w:val="000000"/>
-        </w:rPr>
-        <w:t>. (</w:t>
-      </w:r>
-      <w:proofErr w:type="spellStart"/>
-      <w:r>
-        <w:rPr>
-          <w:rFonts w:ascii="Almendra" w:eastAsia="Arial" w:hAnsi="Almendra" w:cs="Arial"/>
-          <w:color w:val="000000"/>
-        </w:rPr>
-        <w:t>DoD</w:t>
-      </w:r>
-      <w:proofErr w:type="spellEnd"/>
-      <w:r>
-        <w:rPr>
-          <w:rFonts w:ascii="Almendra" w:eastAsia="Arial" w:hAnsi="Almendra" w:cs="Arial"/>
-          <w:color w:val="000000"/>
-        </w:rPr>
-        <w:t xml:space="preserve">: </w:t>
-      </w:r>
-      <w:proofErr w:type="spellStart"/>
-      <w:r>
-        <w:rPr>
-          <w:rFonts w:ascii="Almendra" w:eastAsia="Arial" w:hAnsi="Almendra" w:cs="Arial"/>
-          <w:color w:val="000000"/>
-        </w:rPr>
-        <w:t>Backend</w:t>
-      </w:r>
-      <w:proofErr w:type="spellEnd"/>
-      <w:r>
-        <w:rPr>
-          <w:rFonts w:ascii="Almendra" w:eastAsia="Arial" w:hAnsi="Almendra" w:cs="Arial"/>
-          <w:color w:val="000000"/>
-        </w:rPr>
-        <w:t xml:space="preserve"> poprawnie łączy się z bazą i wykonuje podstawowe operacje odczytu oraz zapisu akt).</w:t>
+        <w:t>Centralny rejestr w PostgreSQL. (DoD: Backend poprawnie łączy się z bazą i wykonuje podstawowe operacje odczytu oraz zapisu akt).</w:t>
       </w:r>
     </w:p>
     <w:p>
@@ -1465,23 +1234,7 @@
           <w:rFonts w:ascii="Almendra" w:eastAsia="Arial" w:hAnsi="Almendra" w:cs="Arial"/>
           <w:color w:val="000000"/>
         </w:rPr>
-        <w:t>Interfejs w języku Holy C. (</w:t>
-      </w:r>
-      <w:proofErr w:type="spellStart"/>
-      <w:r>
-        <w:rPr>
-          <w:rFonts w:ascii="Almendra" w:eastAsia="Arial" w:hAnsi="Almendra" w:cs="Arial"/>
-          <w:color w:val="000000"/>
-        </w:rPr>
-        <w:t>DoD</w:t>
-      </w:r>
-      <w:proofErr w:type="spellEnd"/>
-      <w:r>
-        <w:rPr>
-          <w:rFonts w:ascii="Almendra" w:eastAsia="Arial" w:hAnsi="Almendra" w:cs="Arial"/>
-          <w:color w:val="000000"/>
-        </w:rPr>
-        <w:t>: Interfejs w języku Holy C pozwala na wpisanie danych heretyka i pomyślne przesłanie ich na ołtarz serwera).</w:t>
+        <w:t>Interfejs w języku Holy C. (DoD: Interfejs w języku Holy C pozwala na wpisanie danych heretyka i pomyślne przesłanie ich na ołtarz serwera).</w:t>
       </w:r>
     </w:p>
     <w:p>
@@ -1557,27 +1310,7 @@
           <w:bCs/>
           <w:color w:val="000000"/>
         </w:rPr>
-        <w:t>5.1 Podstawowe funkcjonalności (</w:t>
-      </w:r>
-      <w:proofErr w:type="spellStart"/>
-      <w:r>
-        <w:rPr>
-          <w:rFonts w:ascii="Almendra" w:eastAsia="Arial" w:hAnsi="Almendra" w:cs="Arial"/>
-          <w:b/>
-          <w:bCs/>
-          <w:color w:val="000000"/>
-        </w:rPr>
-        <w:t>must-have</w:t>
-      </w:r>
-      <w:proofErr w:type="spellEnd"/>
-      <w:r>
-        <w:rPr>
-          <w:rFonts w:ascii="Almendra" w:eastAsia="Arial" w:hAnsi="Almendra" w:cs="Arial"/>
-          <w:b/>
-          <w:bCs/>
-          <w:color w:val="000000"/>
-        </w:rPr>
-        <w:t>):</w:t>
+        <w:t>5.1 Podstawowe funkcjonalności (must-have):</w:t>
       </w:r>
     </w:p>
     <w:tbl>
@@ -1924,27 +1657,7 @@
           <w:bCs/>
           <w:color w:val="000000"/>
         </w:rPr>
-        <w:t>5.2 Opcjonalne funkcjonalności (nice-to-</w:t>
-      </w:r>
-      <w:proofErr w:type="spellStart"/>
-      <w:r>
-        <w:rPr>
-          <w:rFonts w:ascii="Almendra" w:eastAsia="Arial" w:hAnsi="Almendra" w:cs="Arial"/>
-          <w:b/>
-          <w:bCs/>
-          <w:color w:val="000000"/>
-        </w:rPr>
-        <w:t>have</w:t>
-      </w:r>
-      <w:proofErr w:type="spellEnd"/>
-      <w:r>
-        <w:rPr>
-          <w:rFonts w:ascii="Almendra" w:eastAsia="Arial" w:hAnsi="Almendra" w:cs="Arial"/>
-          <w:b/>
-          <w:bCs/>
-          <w:color w:val="000000"/>
-        </w:rPr>
-        <w:t>):</w:t>
+        <w:t>5.2 Opcjonalne funkcjonalności (nice-to-have):</w:t>
       </w:r>
     </w:p>
     <w:tbl>
@@ -2396,23 +2109,7 @@
           <w:rFonts w:ascii="Almendra" w:eastAsia="Arial" w:hAnsi="Almendra" w:cs="Arial"/>
           <w:color w:val="000000"/>
         </w:rPr>
-        <w:t xml:space="preserve">Wykorzystanie relacyjnej bazy danych </w:t>
-      </w:r>
-      <w:proofErr w:type="spellStart"/>
-      <w:r>
-        <w:rPr>
-          <w:rFonts w:ascii="Almendra" w:eastAsia="Arial" w:hAnsi="Almendra" w:cs="Arial"/>
-          <w:color w:val="000000"/>
-        </w:rPr>
-        <w:t>PostgreSQL</w:t>
-      </w:r>
-      <w:proofErr w:type="spellEnd"/>
-      <w:r>
-        <w:rPr>
-          <w:rFonts w:ascii="Almendra" w:eastAsia="Arial" w:hAnsi="Almendra" w:cs="Arial"/>
-          <w:color w:val="000000"/>
-        </w:rPr>
-        <w:t>.</w:t>
+        <w:t>Wykorzystanie relacyjnej bazy danych PostgreSQL.</w:t>
       </w:r>
     </w:p>
     <w:p>
@@ -2461,21 +2158,12 @@
           <w:color w:val="000000"/>
         </w:rPr>
       </w:pPr>
-      <w:proofErr w:type="spellStart"/>
       <w:r>
         <w:rPr>
           <w:rFonts w:ascii="Almendra" w:hAnsi="Almendra" w:cs="Arial"/>
           <w:color w:val="000000"/>
         </w:rPr>
-        <w:t>Wieloplatformowość</w:t>
-      </w:r>
-      <w:proofErr w:type="spellEnd"/>
-      <w:r>
-        <w:rPr>
-          <w:rFonts w:ascii="Almendra" w:hAnsi="Almendra" w:cs="Arial"/>
-          <w:color w:val="000000"/>
-        </w:rPr>
-        <w:t xml:space="preserve"> systemu i jego pełna kompatybilność z systemami Windows oraz Linux.</w:t>
+        <w:t>Wieloplatformowość systemu i jego pełna kompatybilność z systemami Windows oraz Linux.</w:t>
       </w:r>
     </w:p>
     <w:p>
@@ -2856,27 +2544,7 @@
                 <w:sz w:val="24"/>
                 <w:szCs w:val="24"/>
               </w:rPr>
-              <w:t xml:space="preserve">Konfiguracja szkieletu serwera w Javie i bazy </w:t>
-            </w:r>
-            <w:proofErr w:type="spellStart"/>
-            <w:r>
-              <w:rPr>
-                <w:rFonts w:ascii="Almendra" w:eastAsia="Arial" w:hAnsi="Almendra" w:cs="Arial"/>
-                <w:color w:val="000000"/>
-                <w:sz w:val="24"/>
-                <w:szCs w:val="24"/>
-              </w:rPr>
-              <w:t>PostgreSQL</w:t>
-            </w:r>
-            <w:proofErr w:type="spellEnd"/>
-            <w:r>
-              <w:rPr>
-                <w:rFonts w:ascii="Almendra" w:eastAsia="Arial" w:hAnsi="Almendra" w:cs="Arial"/>
-                <w:color w:val="000000"/>
-                <w:sz w:val="24"/>
-                <w:szCs w:val="24"/>
-              </w:rPr>
-              <w:t xml:space="preserve">. </w:t>
+              <w:t xml:space="preserve">Konfiguracja szkieletu serwera w Javie i bazy PostgreSQL. </w:t>
             </w:r>
           </w:p>
         </w:tc>
@@ -3034,27 +2702,7 @@
                 <w:sz w:val="24"/>
                 <w:szCs w:val="24"/>
               </w:rPr>
-              <w:t xml:space="preserve">Prace nad podstawowym interfejsem użytkownika we </w:t>
-            </w:r>
-            <w:proofErr w:type="spellStart"/>
-            <w:r>
-              <w:rPr>
-                <w:rFonts w:ascii="Almendra" w:eastAsia="Arial" w:hAnsi="Almendra" w:cs="Arial"/>
-                <w:color w:val="000000"/>
-                <w:sz w:val="24"/>
-                <w:szCs w:val="24"/>
-              </w:rPr>
-              <w:t>frontendzie</w:t>
-            </w:r>
-            <w:proofErr w:type="spellEnd"/>
-            <w:r>
-              <w:rPr>
-                <w:rFonts w:ascii="Almendra" w:eastAsia="Arial" w:hAnsi="Almendra" w:cs="Arial"/>
-                <w:color w:val="000000"/>
-                <w:sz w:val="24"/>
-                <w:szCs w:val="24"/>
-              </w:rPr>
-              <w:t xml:space="preserve">. </w:t>
+              <w:t xml:space="preserve">Prace nad podstawowym interfejsem użytkownika we frontendzie. </w:t>
             </w:r>
           </w:p>
         </w:tc>
@@ -3133,27 +2781,7 @@
                 <w:sz w:val="24"/>
                 <w:szCs w:val="24"/>
               </w:rPr>
-              <w:t>Tworzenie punktów końcowych (</w:t>
-            </w:r>
-            <w:proofErr w:type="spellStart"/>
-            <w:r>
-              <w:rPr>
-                <w:rFonts w:ascii="Almendra" w:eastAsia="Arial" w:hAnsi="Almendra" w:cs="Arial"/>
-                <w:color w:val="000000"/>
-                <w:sz w:val="24"/>
-                <w:szCs w:val="24"/>
-              </w:rPr>
-              <w:t>endpointów</w:t>
-            </w:r>
-            <w:proofErr w:type="spellEnd"/>
-            <w:r>
-              <w:rPr>
-                <w:rFonts w:ascii="Almendra" w:eastAsia="Arial" w:hAnsi="Almendra" w:cs="Arial"/>
-                <w:color w:val="000000"/>
-                <w:sz w:val="24"/>
-                <w:szCs w:val="24"/>
-              </w:rPr>
-              <w:t>/gniazd) po stronie serwera Java.</w:t>
+              <w:t>Tworzenie punktów końcowych (endpointów/gniazd) po stronie serwera Java.</w:t>
             </w:r>
           </w:p>
         </w:tc>
@@ -3232,27 +2860,7 @@
                 <w:sz w:val="24"/>
                 <w:szCs w:val="24"/>
               </w:rPr>
-              <w:t xml:space="preserve">Próby zestawienia komunikacji sieciowej między </w:t>
-            </w:r>
-            <w:proofErr w:type="spellStart"/>
-            <w:r>
-              <w:rPr>
-                <w:rFonts w:ascii="Almendra" w:eastAsia="Arial" w:hAnsi="Almendra" w:cs="Arial"/>
-                <w:color w:val="000000"/>
-                <w:sz w:val="24"/>
-                <w:szCs w:val="24"/>
-              </w:rPr>
-              <w:t>Frontendem</w:t>
-            </w:r>
-            <w:proofErr w:type="spellEnd"/>
-            <w:r>
-              <w:rPr>
-                <w:rFonts w:ascii="Almendra" w:eastAsia="Arial" w:hAnsi="Almendra" w:cs="Arial"/>
-                <w:color w:val="000000"/>
-                <w:sz w:val="24"/>
-                <w:szCs w:val="24"/>
-              </w:rPr>
-              <w:t xml:space="preserve"> a Javą. </w:t>
+              <w:t xml:space="preserve">Próby zestawienia komunikacji sieciowej między Frontendem a Javą. </w:t>
             </w:r>
           </w:p>
         </w:tc>
@@ -3595,20 +3203,31 @@
               <w:spacing w:after="0" w:line="240" w:lineRule="auto"/>
               <w:jc w:val="both"/>
               <w:rPr>
-                <w:rFonts w:ascii="Almendra" w:eastAsia="Arial" w:hAnsi="Almendra" w:cs="Arial"/>
-                <w:color w:val="000000"/>
-                <w:sz w:val="24"/>
-                <w:szCs w:val="24"/>
-              </w:rPr>
-            </w:pPr>
-            <w:r>
-              <w:rPr>
-                <w:rFonts w:ascii="Almendra" w:eastAsia="Arial" w:hAnsi="Almendra" w:cs="Arial"/>
-                <w:color w:val="000000"/>
-                <w:sz w:val="24"/>
-                <w:szCs w:val="24"/>
-              </w:rPr>
-              <w:t>21.12.2027</w:t>
+                <w:rFonts w:asciiTheme="minorHAnsi" w:eastAsia="Arial" w:hAnsiTheme="minorHAnsi" w:cs="Arial"/>
+                <w:color w:val="000000"/>
+                <w:sz w:val="24"/>
+                <w:szCs w:val="24"/>
+                <w:lang w:val="uk-UA"/>
+              </w:rPr>
+            </w:pPr>
+            <w:r>
+              <w:rPr>
+                <w:rFonts w:ascii="Almendra" w:eastAsia="Arial" w:hAnsi="Almendra" w:cs="Arial"/>
+                <w:color w:val="000000"/>
+                <w:sz w:val="24"/>
+                <w:szCs w:val="24"/>
+              </w:rPr>
+              <w:t>21.12.202</w:t>
+            </w:r>
+            <w:r>
+              <w:rPr>
+                <w:rFonts w:asciiTheme="minorHAnsi" w:eastAsia="Arial" w:hAnsiTheme="minorHAnsi" w:cs="Arial"/>
+                <w:color w:val="000000"/>
+                <w:sz w:val="24"/>
+                <w:szCs w:val="24"/>
+                <w:lang w:val="uk-UA"/>
+              </w:rPr>
+              <w:t>6</w:t>
             </w:r>
           </w:p>
         </w:tc>
@@ -3726,27 +3345,7 @@
                 <w:sz w:val="24"/>
                 <w:szCs w:val="24"/>
               </w:rPr>
-              <w:t xml:space="preserve">Ostateczne testy, </w:t>
-            </w:r>
-            <w:proofErr w:type="spellStart"/>
-            <w:r>
-              <w:rPr>
-                <w:rFonts w:ascii="Almendra" w:eastAsia="Arial" w:hAnsi="Almendra" w:cs="Arial"/>
-                <w:color w:val="000000"/>
-                <w:sz w:val="24"/>
-                <w:szCs w:val="24"/>
-              </w:rPr>
-              <w:t>refaktoryzacja</w:t>
-            </w:r>
-            <w:proofErr w:type="spellEnd"/>
-            <w:r>
-              <w:rPr>
-                <w:rFonts w:ascii="Almendra" w:eastAsia="Arial" w:hAnsi="Almendra" w:cs="Arial"/>
-                <w:color w:val="000000"/>
-                <w:sz w:val="24"/>
-                <w:szCs w:val="24"/>
-              </w:rPr>
-              <w:t xml:space="preserve"> i przygotowanie dokumentacji. </w:t>
+              <w:t xml:space="preserve">Ostateczne testy, refaktoryzacja i przygotowanie dokumentacji. </w:t>
             </w:r>
           </w:p>
         </w:tc>
@@ -4038,21 +3637,8 @@
           <w:sz w:val="24"/>
           <w:szCs w:val="24"/>
         </w:rPr>
-        <w:t xml:space="preserve">8.1 Identyfikacja </w:t>
+        <w:t>8.1 Identyfikacja ryzyk</w:t>
       </w:r>
-      <w:proofErr w:type="spellStart"/>
-      <w:r>
-        <w:rPr>
-          <w:rFonts w:ascii="Almendra" w:eastAsia="Arial" w:hAnsi="Almendra" w:cs="Arial"/>
-          <w:b/>
-          <w:bCs/>
-          <w:color w:val="000000"/>
-          <w:sz w:val="24"/>
-          <w:szCs w:val="24"/>
-        </w:rPr>
-        <w:t>ryzyk</w:t>
-      </w:r>
-      <w:proofErr w:type="spellEnd"/>
     </w:p>
     <w:p>
       <w:pPr>
@@ -4105,23 +3691,7 @@
           <w:rFonts w:ascii="Almendra" w:eastAsia="Arial" w:hAnsi="Almendra" w:cs="Arial"/>
           <w:color w:val="000000"/>
         </w:rPr>
-        <w:t xml:space="preserve">Brak zewnętrznych bibliotek i obszernych poradników do rozwiązywania problemów we </w:t>
-      </w:r>
-      <w:proofErr w:type="spellStart"/>
-      <w:r>
-        <w:rPr>
-          <w:rFonts w:ascii="Almendra" w:eastAsia="Arial" w:hAnsi="Almendra" w:cs="Arial"/>
-          <w:color w:val="000000"/>
-        </w:rPr>
-        <w:t>frontendzie</w:t>
-      </w:r>
-      <w:proofErr w:type="spellEnd"/>
-      <w:r>
-        <w:rPr>
-          <w:rFonts w:ascii="Almendra" w:eastAsia="Arial" w:hAnsi="Almendra" w:cs="Arial"/>
-          <w:color w:val="000000"/>
-        </w:rPr>
-        <w:t>.</w:t>
+        <w:t>Brak zewnętrznych bibliotek i obszernych poradników do rozwiązywania problemów we frontendzie.</w:t>
       </w:r>
     </w:p>
     <w:p>
@@ -4198,27 +3768,7 @@
           <w:sz w:val="24"/>
           <w:szCs w:val="24"/>
         </w:rPr>
-        <w:t xml:space="preserve">Szybkie stworzenie najprostszego prototypu (Proof of </w:t>
-      </w:r>
-      <w:proofErr w:type="spellStart"/>
-      <w:r>
-        <w:rPr>
-          <w:rFonts w:ascii="Almendra" w:eastAsia="Arial" w:hAnsi="Almendra" w:cs="Arial"/>
-          <w:color w:val="000000"/>
-          <w:sz w:val="24"/>
-          <w:szCs w:val="24"/>
-        </w:rPr>
-        <w:t>Concept</w:t>
-      </w:r>
-      <w:proofErr w:type="spellEnd"/>
-      <w:r>
-        <w:rPr>
-          <w:rFonts w:ascii="Almendra" w:eastAsia="Arial" w:hAnsi="Almendra" w:cs="Arial"/>
-          <w:color w:val="000000"/>
-          <w:sz w:val="24"/>
-          <w:szCs w:val="24"/>
-        </w:rPr>
-        <w:t>) komunikacji między Javą a Holy C, aby upewnić się o wykonalności zadania, zanim powstaną zaawansowane moduły.</w:t>
+        <w:t>Szybkie stworzenie najprostszego prototypu (Proof of Concept) komunikacji między Javą a Holy C, aby upewnić się o wykonalności zadania, zanim powstaną zaawansowane moduły.</w:t>
       </w:r>
     </w:p>
     <w:p>
@@ -4297,27 +3847,7 @@
           <w:bCs/>
           <w:color w:val="000000"/>
         </w:rPr>
-        <w:t>9.1 Dokumentacja techniczna (</w:t>
-      </w:r>
-      <w:proofErr w:type="spellStart"/>
-      <w:r>
-        <w:rPr>
-          <w:rFonts w:ascii="Almendra" w:eastAsia="Arial" w:hAnsi="Almendra" w:cs="Arial"/>
-          <w:b/>
-          <w:bCs/>
-          <w:color w:val="000000"/>
-        </w:rPr>
-        <w:t>Doxygen</w:t>
-      </w:r>
-      <w:proofErr w:type="spellEnd"/>
-      <w:r>
-        <w:rPr>
-          <w:rFonts w:ascii="Almendra" w:eastAsia="Arial" w:hAnsi="Almendra" w:cs="Arial"/>
-          <w:b/>
-          <w:bCs/>
-          <w:color w:val="000000"/>
-        </w:rPr>
-        <w:t>)</w:t>
+        <w:t>9.1 Dokumentacja techniczna (Doxygen)</w:t>
       </w:r>
     </w:p>
     <w:p>
@@ -4522,37 +4052,8 @@
             <w:sz w:val="24"/>
             <w:szCs w:val="24"/>
           </w:rPr>
-          <w:t>d</w:t>
+          <w:t>do Jiry</w:t>
         </w:r>
-        <w:r>
-          <w:rPr>
-            <w:rStyle w:val="Hyperlink"/>
-            <w:rFonts w:ascii="Almendra" w:eastAsia="Arial" w:hAnsi="Almendra" w:cs="Arial"/>
-            <w:sz w:val="24"/>
-            <w:szCs w:val="24"/>
-          </w:rPr>
-          <w:t>o</w:t>
-        </w:r>
-        <w:r>
-          <w:rPr>
-            <w:rStyle w:val="Hyperlink"/>
-            <w:rFonts w:ascii="Almendra" w:eastAsia="Arial" w:hAnsi="Almendra" w:cs="Arial"/>
-            <w:sz w:val="24"/>
-            <w:szCs w:val="24"/>
-          </w:rPr>
-          <w:t xml:space="preserve"> </w:t>
-        </w:r>
-        <w:proofErr w:type="spellStart"/>
-        <w:r>
-          <w:rPr>
-            <w:rStyle w:val="Hyperlink"/>
-            <w:rFonts w:ascii="Almendra" w:eastAsia="Arial" w:hAnsi="Almendra" w:cs="Arial"/>
-            <w:sz w:val="24"/>
-            <w:szCs w:val="24"/>
-          </w:rPr>
-          <w:t>Jiry</w:t>
-        </w:r>
-        <w:proofErr w:type="spellEnd"/>
       </w:hyperlink>
     </w:p>
     <w:p>
@@ -4740,7 +4241,7 @@
             </wp:anchor>
           </w:drawing>
         </mc:Choice>
-        <mc:Fallback xmlns:cr="http://schemas.microsoft.com/office/comments/2020/reactions" xmlns="http://schemas.microsoft.com/office/tasks/2019/documenttasks" xmlns:dgm="http://schemas.openxmlformats.org/drawingml/2006/diagram" xmlns:lc="http://schemas.openxmlformats.org/drawingml/2006/lockedCanvas" xmlns:c="http://schemas.openxmlformats.org/drawingml/2006/chart" xmlns:pic="http://schemas.openxmlformats.org/drawingml/2006/picture" xmlns:a="http://schemas.openxmlformats.org/drawingml/2006/main" xmlns:sl="http://schemas.openxmlformats.org/schemaLibrary/2006/main">
+        <mc:Fallback xmlns:sl="http://schemas.openxmlformats.org/schemaLibrary/2006/main" xmlns:a="http://schemas.openxmlformats.org/drawingml/2006/main" xmlns:pic="http://schemas.openxmlformats.org/drawingml/2006/picture" xmlns:c="http://schemas.openxmlformats.org/drawingml/2006/chart" xmlns:lc="http://schemas.openxmlformats.org/drawingml/2006/lockedCanvas" xmlns:dgm="http://schemas.openxmlformats.org/drawingml/2006/diagram" xmlns="http://schemas.microsoft.com/office/tasks/2019/documenttasks" xmlns:cr="http://schemas.microsoft.com/office/comments/2020/reactions">
           <w:drawing>
             <wp:anchor allowOverlap="1" behindDoc="1" distB="0" distT="0" distL="0" distR="0" hidden="0" layoutInCell="1" locked="0" relativeHeight="0" simplePos="0">
               <wp:simplePos x="0" y="0"/>
@@ -4858,7 +4359,7 @@
             </wp:anchor>
           </w:drawing>
         </mc:Choice>
-        <mc:Fallback xmlns:cr="http://schemas.microsoft.com/office/comments/2020/reactions" xmlns="http://schemas.microsoft.com/office/tasks/2019/documenttasks" xmlns:dgm="http://schemas.openxmlformats.org/drawingml/2006/diagram" xmlns:lc="http://schemas.openxmlformats.org/drawingml/2006/lockedCanvas" xmlns:c="http://schemas.openxmlformats.org/drawingml/2006/chart" xmlns:pic="http://schemas.openxmlformats.org/drawingml/2006/picture" xmlns:a="http://schemas.openxmlformats.org/drawingml/2006/main" xmlns:sl="http://schemas.openxmlformats.org/schemaLibrary/2006/main">
+        <mc:Fallback xmlns:sl="http://schemas.openxmlformats.org/schemaLibrary/2006/main" xmlns:a="http://schemas.openxmlformats.org/drawingml/2006/main" xmlns:pic="http://schemas.openxmlformats.org/drawingml/2006/picture" xmlns:c="http://schemas.openxmlformats.org/drawingml/2006/chart" xmlns:lc="http://schemas.openxmlformats.org/drawingml/2006/lockedCanvas" xmlns:dgm="http://schemas.openxmlformats.org/drawingml/2006/diagram" xmlns="http://schemas.microsoft.com/office/tasks/2019/documenttasks" xmlns:cr="http://schemas.microsoft.com/office/comments/2020/reactions">
           <w:drawing>
             <wp:anchor allowOverlap="1" behindDoc="1" distB="0" distT="0" distL="0" distR="0" hidden="0" layoutInCell="1" locked="0" relativeHeight="0" simplePos="0">
               <wp:simplePos x="0" y="0"/>
@@ -5066,7 +4567,7 @@
             </wp:anchor>
           </w:drawing>
         </mc:Choice>
-        <mc:Fallback xmlns:cr="http://schemas.microsoft.com/office/comments/2020/reactions" xmlns="http://schemas.microsoft.com/office/tasks/2019/documenttasks" xmlns:dgm="http://schemas.openxmlformats.org/drawingml/2006/diagram" xmlns:lc="http://schemas.openxmlformats.org/drawingml/2006/lockedCanvas" xmlns:c="http://schemas.openxmlformats.org/drawingml/2006/chart" xmlns:pic="http://schemas.openxmlformats.org/drawingml/2006/picture" xmlns:a="http://schemas.openxmlformats.org/drawingml/2006/main" xmlns:sl="http://schemas.openxmlformats.org/schemaLibrary/2006/main">
+        <mc:Fallback xmlns:sl="http://schemas.openxmlformats.org/schemaLibrary/2006/main" xmlns:a="http://schemas.openxmlformats.org/drawingml/2006/main" xmlns:pic="http://schemas.openxmlformats.org/drawingml/2006/picture" xmlns:c="http://schemas.openxmlformats.org/drawingml/2006/chart" xmlns:lc="http://schemas.openxmlformats.org/drawingml/2006/lockedCanvas" xmlns:dgm="http://schemas.openxmlformats.org/drawingml/2006/diagram" xmlns="http://schemas.microsoft.com/office/tasks/2019/documenttasks" xmlns:cr="http://schemas.microsoft.com/office/comments/2020/reactions">
           <w:drawing>
             <wp:anchor allowOverlap="1" behindDoc="1" distB="0" distT="0" distL="0" distR="0" hidden="0" layoutInCell="1" locked="0" relativeHeight="0" simplePos="0">
               <wp:simplePos x="0" y="0"/>
@@ -5226,7 +4727,7 @@
             </wp:anchor>
           </w:drawing>
         </mc:Choice>
-        <mc:Fallback xmlns:cr="http://schemas.microsoft.com/office/comments/2020/reactions" xmlns="http://schemas.microsoft.com/office/tasks/2019/documenttasks" xmlns:dgm="http://schemas.openxmlformats.org/drawingml/2006/diagram" xmlns:lc="http://schemas.openxmlformats.org/drawingml/2006/lockedCanvas" xmlns:c="http://schemas.openxmlformats.org/drawingml/2006/chart" xmlns:pic="http://schemas.openxmlformats.org/drawingml/2006/picture" xmlns:a="http://schemas.openxmlformats.org/drawingml/2006/main" xmlns:sl="http://schemas.openxmlformats.org/schemaLibrary/2006/main">
+        <mc:Fallback xmlns:sl="http://schemas.openxmlformats.org/schemaLibrary/2006/main" xmlns:a="http://schemas.openxmlformats.org/drawingml/2006/main" xmlns:pic="http://schemas.openxmlformats.org/drawingml/2006/picture" xmlns:c="http://schemas.openxmlformats.org/drawingml/2006/chart" xmlns:lc="http://schemas.openxmlformats.org/drawingml/2006/lockedCanvas" xmlns:dgm="http://schemas.openxmlformats.org/drawingml/2006/diagram" xmlns="http://schemas.microsoft.com/office/tasks/2019/documenttasks" xmlns:cr="http://schemas.microsoft.com/office/comments/2020/reactions">
           <w:drawing>
             <wp:anchor allowOverlap="1" behindDoc="1" distB="0" distT="0" distL="0" distR="0" hidden="0" layoutInCell="1" locked="0" relativeHeight="0" simplePos="0">
               <wp:simplePos x="0" y="0"/>
@@ -6151,6 +5652,7 @@
   <w:style w:type="character" w:default="1" w:styleId="DefaultParagraphFont">
     <w:name w:val="Default Paragraph Font"/>
     <w:uiPriority w:val="1"/>
+    <w:semiHidden/>
     <w:unhideWhenUsed/>
   </w:style>
   <w:style w:type="table" w:default="1" w:styleId="TableNormal">

</xml_diff>